<commit_message>
Etiquetas del mapa: nombre común + código (Plus Code) entre paréntesis
- Prompt de Antigravity: añade columna Código y etiqueta 'nombre común (código)'
- generar_mapa.py: etiquetas con nombre común y Plus Code; regenera mapa e informe
- Nota de legibilidad (leader lines / últimos 4 caracteres) ante solape

Co-Authored-By: Claude Fable 5 <noreply@anthropic.com>
Claude-Session: https://claude.ai/code/session_01442Fz9ZmmTFnvPw1BsonXT
</commit_message>
<xml_diff>
--- a/Estudio_Arbolado_Parque_Central_Saraguro/Informe_Tecnico_Arbolado_Parque_Central_Saraguro.docx
+++ b/Estudio_Arbolado_Parque_Central_Saraguro/Informe_Tecnico_Arbolado_Parque_Central_Saraguro.docx
@@ -552,7 +552,7 @@
       <w:r>
         <w:drawing>
           <wp:inline xmlns:a="http://schemas.openxmlformats.org/drawingml/2006/main" xmlns:pic="http://schemas.openxmlformats.org/drawingml/2006/picture">
-            <wp:extent cx="6120000" cy="3971250"/>
+            <wp:extent cx="6120000" cy="4035998"/>
             <wp:docPr id="3" name="Picture 3"/>
             <wp:cNvGraphicFramePr>
               <a:graphicFrameLocks noChangeAspect="1"/>
@@ -573,7 +573,7 @@
                   <pic:spPr>
                     <a:xfrm>
                       <a:off x="0" y="0"/>
-                      <a:ext cx="6120000" cy="3971250"/>
+                      <a:ext cx="6120000" cy="4035998"/>
                     </a:xfrm>
                     <a:prstGeom prst="rect"/>
                   </pic:spPr>

</xml_diff>

<commit_message>
Infografía 'El árbol promedio': semáforo del estado por componente (moda de 40 árboles)
- generar_infografia.py: SVG del árbol raíz→cima con semáforo verde/ámbar/rojo/gris según la moda
- Raíz No visible (translúcida), Fuste/Ramas ámbar (regular), Corteza/Hojas/Cima verde, Copa simétrica; forma intermedia conífera/latifoliada
- Datos puntuales (altura/diámetro/follaje medios, madurez, porte, afección y agente más comunes, veredicto global)
- Render PNG con Chromium; embebida como Figura 2 en la Sección 5 del informe (Word y PDF)

Co-Authored-By: Claude Fable 5 <noreply@anthropic.com>
Claude-Session: https://claude.ai/code/session_01442Fz9ZmmTFnvPw1BsonXT
</commit_message>
<xml_diff>
--- a/Estudio_Arbolado_Parque_Central_Saraguro/Informe_Tecnico_Arbolado_Parque_Central_Saraguro.docx
+++ b/Estudio_Arbolado_Parque_Central_Saraguro/Informe_Tecnico_Arbolado_Parque_Central_Saraguro.docx
@@ -2591,7 +2591,61 @@
           <w:i w:val="0"/>
           <w:sz w:val="21"/>
         </w:rPr>
-        <w:t>Esta sección resume la salud del arbolado a partir de cinco categorías evaluadas en campo: (i) estado fitosanitario de sus componentes (raíz, fuste, corteza, ramas, hojas, cima y copa); (ii) presencia de enfermedades; (iii) ubicación de las enfermedades; (iv) presencia de plagas; y (v) ubicación de las plagas. El detalle por árbol se presenta en la ficha de salud (5.5).</w:t>
+        <w:t>Esta sección resume la salud del arbolado a partir de cinco categorías evaluadas en campo: (i) estado fitosanitario de sus componentes (raíz, fuste, corteza, ramas, hojas, cima y copa); (ii) presencia de enfermedades; (iii) ubicación de las enfermedades; (iv) presencia de plagas; y (v) ubicación de las plagas. El detalle por árbol se presenta en la ficha de salud (5.5). La Figura 2 sintetiza, en un «árbol promedio», el estado más frecuente (moda) de cada componente.</w:t>
+      </w:r>
+    </w:p>
+    <w:p>
+      <w:pPr>
+        <w:jc w:val="center"/>
+      </w:pPr>
+      <w:r>
+        <w:drawing>
+          <wp:inline xmlns:a="http://schemas.openxmlformats.org/drawingml/2006/main" xmlns:pic="http://schemas.openxmlformats.org/drawingml/2006/picture">
+            <wp:extent cx="5220000" cy="6819677"/>
+            <wp:docPr id="4" name="Picture 4"/>
+            <wp:cNvGraphicFramePr>
+              <a:graphicFrameLocks noChangeAspect="1"/>
+            </wp:cNvGraphicFramePr>
+            <a:graphic>
+              <a:graphicData uri="http://schemas.openxmlformats.org/drawingml/2006/picture">
+                <pic:pic>
+                  <pic:nvPicPr>
+                    <pic:cNvPr id="0" name="infografia_arbol_promedio.png"/>
+                    <pic:cNvPicPr/>
+                  </pic:nvPicPr>
+                  <pic:blipFill>
+                    <a:blip r:embed="rId12"/>
+                    <a:stretch>
+                      <a:fillRect/>
+                    </a:stretch>
+                  </pic:blipFill>
+                  <pic:spPr>
+                    <a:xfrm>
+                      <a:off x="0" y="0"/>
+                      <a:ext cx="5220000" cy="6819677"/>
+                    </a:xfrm>
+                    <a:prstGeom prst="rect"/>
+                  </pic:spPr>
+                </pic:pic>
+              </a:graphicData>
+            </a:graphic>
+          </wp:inline>
+        </w:drawing>
+      </w:r>
+    </w:p>
+    <w:p>
+      <w:pPr>
+        <w:spacing w:after="160"/>
+        <w:jc w:val="center"/>
+      </w:pPr>
+      <w:r>
+        <w:rPr>
+          <w:b w:val="0"/>
+          <w:i/>
+          <w:color w:val="424242"/>
+          <w:sz w:val="17"/>
+        </w:rPr>
+        <w:t>Figura 2. «El árbol promedio de Saraguro»: cada elemento se colorea según el valor más frecuente (moda) de los 40 árboles (verde = bueno, ámbar = regular, rojo = malo, gris = no visible).</w:t>
       </w:r>
     </w:p>
     <w:p>

</xml_diff>

<commit_message>
Infografía rediseñada a estilo científico: ilustración botánica, fondo blanco
- Follaje texturizado y sombreado, tronco con corteza y contrafuertes, raíces atenuadas
- Fondo blanco, título/caption académicos, leyenda de semáforo, anotaciones con barra de estado y tabla de parámetros con filetes
- Semáforo por componente según la moda de 40 árboles; forma intermedia conífera/latifoliada
- Render PNG con Chromium; embebida como Figura 2 en la Sección 5

Co-Authored-By: Claude Fable 5 <noreply@anthropic.com>
Claude-Session: https://claude.ai/code/session_01442Fz9ZmmTFnvPw1BsonXT
</commit_message>
<xml_diff>
--- a/Estudio_Arbolado_Parque_Central_Saraguro/Informe_Tecnico_Arbolado_Parque_Central_Saraguro.docx
+++ b/Estudio_Arbolado_Parque_Central_Saraguro/Informe_Tecnico_Arbolado_Parque_Central_Saraguro.docx
@@ -2601,7 +2601,7 @@
       <w:r>
         <w:drawing>
           <wp:inline xmlns:a="http://schemas.openxmlformats.org/drawingml/2006/main" xmlns:pic="http://schemas.openxmlformats.org/drawingml/2006/picture">
-            <wp:extent cx="5220000" cy="6819677"/>
+            <wp:extent cx="5220000" cy="7196143"/>
             <wp:docPr id="4" name="Picture 4"/>
             <wp:cNvGraphicFramePr>
               <a:graphicFrameLocks noChangeAspect="1"/>
@@ -2622,7 +2622,7 @@
                   <pic:spPr>
                     <a:xfrm>
                       <a:off x="0" y="0"/>
-                      <a:ext cx="5220000" cy="6819677"/>
+                      <a:ext cx="5220000" cy="7196143"/>
                     </a:xfrm>
                     <a:prstGeom prst="rect"/>
                   </pic:spPr>

</xml_diff>

<commit_message>
Añade Resumen gráfico (graphical abstract) al inicio del informe con la infografía y síntesis descriptiva
- Nueva sección 'Resumen gráfico' tras la portada: árbol tipo + resumen + 3 viñetas clave
- Sección 5 ahora referencia el Resumen gráfico (sin duplicar la imagen)
- Prompt maestro de Antigravity actualizado (nota del resumen gráfico pre-renderizado)

Co-Authored-By: Claude Fable 5 <noreply@anthropic.com>
Claude-Session: https://claude.ai/code/session_01442Fz9ZmmTFnvPw1BsonXT
</commit_message>
<xml_diff>
--- a/Estudio_Arbolado_Parque_Central_Saraguro/Informe_Tecnico_Arbolado_Parque_Central_Saraguro.docx
+++ b/Estudio_Arbolado_Parque_Central_Saraguro/Informe_Tecnico_Arbolado_Parque_Central_Saraguro.docx
@@ -307,6 +307,124 @@
           <w:sz w:val="21"/>
         </w:rPr>
         <w:t>Loja, 11 de julio de 2026</w:t>
+      </w:r>
+    </w:p>
+    <w:p>
+      <w:r>
+        <w:br w:type="page"/>
+      </w:r>
+    </w:p>
+    <w:p>
+      <w:pPr>
+        <w:pStyle w:val="Heading1"/>
+      </w:pPr>
+      <w:r>
+        <w:rPr>
+          <w:color w:val="1B5E20"/>
+          <w:sz w:val="30"/>
+        </w:rPr>
+        <w:t>Resumen gráfico</w:t>
+      </w:r>
+    </w:p>
+    <w:p>
+      <w:pPr>
+        <w:spacing w:after="120"/>
+        <w:jc w:val="both"/>
+      </w:pPr>
+      <w:r>
+        <w:rPr>
+          <w:b w:val="0"/>
+          <w:i w:val="0"/>
+          <w:sz w:val="21"/>
+        </w:rPr>
+        <w:t>El estudio evaluó 40 árboles (36 en el Parque Central y 4 en la isleta de la Avenida El Oro), de 16 especies. La ilustración sintetiza, en un «árbol tipo», el estado sanitario más frecuente (moda) de cada componente: copa, hojas, cima y corteza en buen estado; fuste y ramas en estado regular; y raíz no evaluable a simple vista. El arbolado muestra buena vitalidad general (follaje medio 83 %), con afecciones de bajo impacto estructural (decoloración foliar y epífitas/líquenes) y pocos casos de deterioro estructural.</w:t>
+      </w:r>
+    </w:p>
+    <w:p>
+      <w:pPr>
+        <w:pStyle w:val="ListBullet"/>
+      </w:pPr>
+      <w:r>
+        <w:rPr>
+          <w:sz w:val="21"/>
+        </w:rPr>
+        <w:t>Forma dominante intermedia: 7 coníferas (ápice agudo) + 33 latifoliadas (copa ancha).</w:t>
+      </w:r>
+    </w:p>
+    <w:p>
+      <w:pPr>
+        <w:pStyle w:val="ListBullet"/>
+      </w:pPr>
+      <w:r>
+        <w:rPr>
+          <w:sz w:val="21"/>
+        </w:rPr>
+        <w:t>Seguridad: un único punto crítico de riesgo de caída (árbol A06, propuesto para derribo). Casos estructurales a vigilar: pudrición del tronco (AV02, A25) y raíz comprometida (A07, AV04).</w:t>
+      </w:r>
+    </w:p>
+    <w:p>
+      <w:pPr>
+        <w:pStyle w:val="ListBullet"/>
+      </w:pPr>
+      <w:r>
+        <w:rPr>
+          <w:sz w:val="21"/>
+        </w:rPr>
+        <w:t>Veredicto técnico global: 1 derribo · 21 conservar con intervención · 18 conservar.</w:t>
+      </w:r>
+    </w:p>
+    <w:p>
+      <w:pPr>
+        <w:jc w:val="center"/>
+      </w:pPr>
+      <w:r>
+        <w:drawing>
+          <wp:inline xmlns:a="http://schemas.openxmlformats.org/drawingml/2006/main" xmlns:pic="http://schemas.openxmlformats.org/drawingml/2006/picture">
+            <wp:extent cx="4680000" cy="6451714"/>
+            <wp:docPr id="3" name="Picture 3"/>
+            <wp:cNvGraphicFramePr>
+              <a:graphicFrameLocks noChangeAspect="1"/>
+            </wp:cNvGraphicFramePr>
+            <a:graphic>
+              <a:graphicData uri="http://schemas.openxmlformats.org/drawingml/2006/picture">
+                <pic:pic>
+                  <pic:nvPicPr>
+                    <pic:cNvPr id="0" name="infografia_arbol_promedio.png"/>
+                    <pic:cNvPicPr/>
+                  </pic:nvPicPr>
+                  <pic:blipFill>
+                    <a:blip r:embed="rId11"/>
+                    <a:stretch>
+                      <a:fillRect/>
+                    </a:stretch>
+                  </pic:blipFill>
+                  <pic:spPr>
+                    <a:xfrm>
+                      <a:off x="0" y="0"/>
+                      <a:ext cx="4680000" cy="6451714"/>
+                    </a:xfrm>
+                    <a:prstGeom prst="rect"/>
+                  </pic:spPr>
+                </pic:pic>
+              </a:graphicData>
+            </a:graphic>
+          </wp:inline>
+        </w:drawing>
+      </w:r>
+    </w:p>
+    <w:p>
+      <w:pPr>
+        <w:spacing w:after="120"/>
+        <w:jc w:val="center"/>
+      </w:pPr>
+      <w:r>
+        <w:rPr>
+          <w:b w:val="0"/>
+          <w:i/>
+          <w:color w:val="424242"/>
+          <w:sz w:val="17"/>
+        </w:rPr>
+        <w:t>Cada componente se representa con el valor más frecuente (moda) entre los 40 árboles; la raíz aparece atenuada por no ser evaluable a simple vista. Semáforo: verde = bueno · ámbar = regular · rojo = malo · gris = no visible.</w:t>
       </w:r>
     </w:p>
     <w:p>
@@ -553,7 +671,7 @@
         <w:drawing>
           <wp:inline xmlns:a="http://schemas.openxmlformats.org/drawingml/2006/main" xmlns:pic="http://schemas.openxmlformats.org/drawingml/2006/picture">
             <wp:extent cx="6120000" cy="4179238"/>
-            <wp:docPr id="3" name="Picture 3"/>
+            <wp:docPr id="4" name="Picture 4"/>
             <wp:cNvGraphicFramePr>
               <a:graphicFrameLocks noChangeAspect="1"/>
             </wp:cNvGraphicFramePr>
@@ -565,7 +683,7 @@
                     <pic:cNvPicPr/>
                   </pic:nvPicPr>
                   <pic:blipFill>
-                    <a:blip r:embed="rId11"/>
+                    <a:blip r:embed="rId12"/>
                     <a:stretch>
                       <a:fillRect/>
                     </a:stretch>
@@ -2591,61 +2709,7 @@
           <w:i w:val="0"/>
           <w:sz w:val="21"/>
         </w:rPr>
-        <w:t>Esta sección resume la salud del arbolado a partir de cinco categorías evaluadas en campo: (i) estado fitosanitario de sus componentes (raíz, fuste, corteza, ramas, hojas, cima y copa); (ii) presencia de enfermedades; (iii) ubicación de las enfermedades; (iv) presencia de plagas; y (v) ubicación de las plagas. El detalle por árbol se presenta en la ficha de salud (5.5). La Figura 2 sintetiza, en un «árbol promedio», el estado más frecuente (moda) de cada componente.</w:t>
-      </w:r>
-    </w:p>
-    <w:p>
-      <w:pPr>
-        <w:jc w:val="center"/>
-      </w:pPr>
-      <w:r>
-        <w:drawing>
-          <wp:inline xmlns:a="http://schemas.openxmlformats.org/drawingml/2006/main" xmlns:pic="http://schemas.openxmlformats.org/drawingml/2006/picture">
-            <wp:extent cx="5220000" cy="7196143"/>
-            <wp:docPr id="4" name="Picture 4"/>
-            <wp:cNvGraphicFramePr>
-              <a:graphicFrameLocks noChangeAspect="1"/>
-            </wp:cNvGraphicFramePr>
-            <a:graphic>
-              <a:graphicData uri="http://schemas.openxmlformats.org/drawingml/2006/picture">
-                <pic:pic>
-                  <pic:nvPicPr>
-                    <pic:cNvPr id="0" name="infografia_arbol_promedio.png"/>
-                    <pic:cNvPicPr/>
-                  </pic:nvPicPr>
-                  <pic:blipFill>
-                    <a:blip r:embed="rId12"/>
-                    <a:stretch>
-                      <a:fillRect/>
-                    </a:stretch>
-                  </pic:blipFill>
-                  <pic:spPr>
-                    <a:xfrm>
-                      <a:off x="0" y="0"/>
-                      <a:ext cx="5220000" cy="7196143"/>
-                    </a:xfrm>
-                    <a:prstGeom prst="rect"/>
-                  </pic:spPr>
-                </pic:pic>
-              </a:graphicData>
-            </a:graphic>
-          </wp:inline>
-        </w:drawing>
-      </w:r>
-    </w:p>
-    <w:p>
-      <w:pPr>
-        <w:spacing w:after="160"/>
-        <w:jc w:val="center"/>
-      </w:pPr>
-      <w:r>
-        <w:rPr>
-          <w:b w:val="0"/>
-          <w:i/>
-          <w:color w:val="424242"/>
-          <w:sz w:val="17"/>
-        </w:rPr>
-        <w:t>Figura 2. «El árbol promedio de Saraguro»: cada elemento se colorea según el valor más frecuente (moda) de los 40 árboles (verde = bueno, ámbar = regular, rojo = malo, gris = no visible).</w:t>
+        <w:t>Esta sección resume la salud del arbolado a partir de cinco categorías evaluadas en campo: (i) estado fitosanitario de sus componentes (raíz, fuste, corteza, ramas, hojas, cima y copa); (ii) presencia de enfermedades; (iii) ubicación de las enfermedades; (iv) presencia de plagas; y (v) ubicación de las plagas. El detalle por árbol se presenta en la ficha de salud (5.5); el «árbol tipo» del Resumen gráfico (al inicio del informe) sintetiza el estado más frecuente (moda) de cada componente.</w:t>
       </w:r>
     </w:p>
     <w:p>

</xml_diff>